<commit_message>
Exportacao Andorra-Brasil via RDC 660: o que a receita permite e o arranjo licito
Co-Authored-By: Claude <noreply@anthropic.com>
Claude-Session: https://claude.ai/code/session_018WZd4PZy53xqMaYcFDrxLe
</commit_message>
<xml_diff>
--- a/docs/cannabis/LICENCAS_VENDA_CBD_ANDORRA_BRASIL.docx
+++ b/docs/cannabis/LICENCAS_VENDA_CBD_ANDORRA_BRASIL.docx
@@ -578,6 +578,390 @@
       </w:r>
       <w:r>
         <w:t xml:space="preserve"> — fornecimento sem lucro aos associados, mediante autorizacao judicial (o caminho do nosso estatuto). Nao e venda comercial.</w:t>
+      </w:r>
+    </w:p>
+    <w:p>
+      <w:pPr>
+        <w:pStyle w:val="Heading1"/>
+        <w:jc w:val="center"/>
+      </w:pPr>
+      <w:r>
+        <w:rPr>
+          <w:b/>
+          <w:bCs/>
+        </w:rPr>
+        <w:t xml:space="preserve">2b. "Mas a empresa de Andorra pode EXPORTAR para o Brasil, se o medico prescrever?" — a explicacao completa</w:t>
+      </w:r>
+    </w:p>
+    <w:p>
+      <w:pPr>
+        <w:spacing w:after="160"/>
+        <w:jc w:val="both"/>
+      </w:pPr>
+      <w:r>
+        <w:t xml:space="preserve">A pergunta mistura duas coisas que precisam ser separadas: o que a receita do medico (CRM) autoriza, e o que a empresa estrangeira precisa ter. Vamos por partes.</w:t>
+      </w:r>
+    </w:p>
+    <w:p>
+      <w:pPr>
+        <w:pStyle w:val="Heading2"/>
+        <w:jc w:val="center"/>
+      </w:pPr>
+      <w:r>
+        <w:rPr>
+          <w:b/>
+          <w:bCs/>
+        </w:rPr>
+        <w:t xml:space="preserve">O que a receita do medico realmente faz</w:t>
+      </w:r>
+    </w:p>
+    <w:p>
+      <w:pPr>
+        <w:spacing w:after="160"/>
+        <w:jc w:val="both"/>
+      </w:pPr>
+      <w:r>
+        <w:t xml:space="preserve">Na via da RDC 660/2022, quem recebe a autorizacao da ANVISA e o </w:t>
+      </w:r>
+      <w:r>
+        <w:rPr>
+          <w:b/>
+          <w:bCs/>
+        </w:rPr>
+        <w:t xml:space="preserve">PACIENTE</w:t>
+      </w:r>
+      <w:r>
+        <w:t xml:space="preserve">, nunca a empresa. O fluxo e:</w:t>
+      </w:r>
+    </w:p>
+    <w:p>
+      <w:pPr>
+        <w:spacing w:after="120"/>
+        <w:ind w:left="360"/>
+      </w:pPr>
+      <w:r>
+        <w:rPr>
+          <w:b/>
+          <w:bCs/>
+        </w:rPr>
+        <w:t xml:space="preserve">1. </w:t>
+      </w:r>
+      <w:r>
+        <w:t xml:space="preserve">Medico com CRM prescreve o produto (receita valida, com nome do produto e posologia).</w:t>
+      </w:r>
+    </w:p>
+    <w:p>
+      <w:pPr>
+        <w:spacing w:after="120"/>
+        <w:ind w:left="360"/>
+      </w:pPr>
+      <w:r>
+        <w:rPr>
+          <w:b/>
+          <w:bCs/>
+        </w:rPr>
+        <w:t xml:space="preserve">2. </w:t>
+      </w:r>
+      <w:r>
+        <w:t xml:space="preserve">O paciente cadastra a receita no Gov.br e recebe a </w:t>
+      </w:r>
+      <w:r>
+        <w:rPr>
+          <w:b/>
+          <w:bCs/>
+        </w:rPr>
+        <w:t xml:space="preserve">Autorizacao de Importacao</w:t>
+      </w:r>
+      <w:r>
+        <w:t xml:space="preserve"> da ANVISA (validade de 2 anos).</w:t>
+      </w:r>
+    </w:p>
+    <w:p>
+      <w:pPr>
+        <w:spacing w:after="120"/>
+        <w:ind w:left="360"/>
+      </w:pPr>
+      <w:r>
+        <w:rPr>
+          <w:b/>
+          <w:bCs/>
+        </w:rPr>
+        <w:t xml:space="preserve">3. </w:t>
+      </w:r>
+      <w:r>
+        <w:t xml:space="preserve">O paciente (ou seu representante) compra do fornecedor estrangeiro e importa PARA USO PROPRIO — por remessa expressa ou bagagem.</w:t>
+      </w:r>
+    </w:p>
+    <w:p>
+      <w:pPr>
+        <w:spacing w:after="160"/>
+        <w:jc w:val="both"/>
+      </w:pPr>
+      <w:r>
+        <w:t xml:space="preserve">Ou seja: a receita do CRM abre a porta da IMPORTACAO PELO PACIENTE. Ela nao licencia empresa nenhuma. A empresa estrangeira, nessa via, e apenas a vendedora la fora que despacha para o endereco do paciente.</w:t>
+      </w:r>
+    </w:p>
+    <w:p>
+      <w:pPr>
+        <w:pStyle w:val="Heading2"/>
+        <w:jc w:val="center"/>
+      </w:pPr>
+      <w:r>
+        <w:rPr>
+          <w:b/>
+          <w:bCs/>
+        </w:rPr>
+        <w:t xml:space="preserve">Entao a empresa estrangeira pode vender para pacientes brasileiros?</w:t>
+      </w:r>
+    </w:p>
+    <w:p>
+      <w:pPr>
+        <w:spacing w:after="160"/>
+        <w:jc w:val="both"/>
+      </w:pPr>
+      <w:r>
+        <w:rPr>
+          <w:b/>
+          <w:bCs/>
+        </w:rPr>
+        <w:t xml:space="preserve">Pode — e e exatamente assim que operam as marcas americanas e europeias que os pacientes brasileiros importam hoje.</w:t>
+      </w:r>
+      <w:r>
+        <w:t xml:space="preserve"> A empresa estrangeira nao precisa de licenca BRASILEIRA nessa via. Mas ha uma condicao da propria RDC 660 que decide tudo:</w:t>
+      </w:r>
+    </w:p>
+    <w:p>
+      <w:pPr>
+        <w:spacing w:after="160"/>
+        <w:jc w:val="both"/>
+      </w:pPr>
+      <w:r>
+        <w:t xml:space="preserve">&gt; O produto importado deve ser </w:t>
+      </w:r>
+      <w:r>
+        <w:rPr>
+          <w:b/>
+          <w:bCs/>
+        </w:rPr>
+        <w:t xml:space="preserve">regularizado para consumo no pais de &gt; origem</w:t>
+      </w:r>
+      <w:r>
+        <w:t xml:space="preserve"> (ou em pais que o regularize).</w:t>
+      </w:r>
+    </w:p>
+    <w:p>
+      <w:pPr>
+        <w:spacing w:after="160"/>
+        <w:jc w:val="both"/>
+      </w:pPr>
+      <w:r>
+        <w:t xml:space="preserve">E aqui Andorra quebra: </w:t>
+      </w:r>
+      <w:r>
+        <w:rPr>
+          <w:b/>
+          <w:bCs/>
+        </w:rPr>
+        <w:t xml:space="preserve">CBD medicinal nao e regularizado em Andorra</w:t>
+      </w:r>
+      <w:r>
+        <w:t xml:space="preserve">. Nao ha lei de cannabis medicinal em vigor, nao ha registro de produto, nao ha fabricante licenciado, e derivados de cannabis nao tem via legal de comercializacao local (fora cosmeticos da UE). Um frasco de oleo CBD "origem Andorra" nao atende ao requisito da RDC 660 — a ANVISA pode barrar na remessa — e, antes disso, a propria empresa teria problema em Andorra para PRODUZIR, ESTOCAR e DESPACHAR o produto (posse e comercio nao regulamentados; houve caso de detencao na fronteira por 500 g de CBD). E Andorra esta fora da uniao aduaneira da UE: qualquer remessa cruza a alfandega da Franca ou da Espanha sob regras de entorpecentes.</w:t>
+      </w:r>
+    </w:p>
+    <w:p>
+      <w:pPr>
+        <w:pStyle w:val="Heading2"/>
+        <w:jc w:val="center"/>
+      </w:pPr>
+      <w:r>
+        <w:rPr>
+          <w:b/>
+          <w:bCs/>
+        </w:rPr>
+        <w:t xml:space="preserve">O arranjo que FUNCIONA com uma empresa andorrana</w:t>
+      </w:r>
+    </w:p>
+    <w:p>
+      <w:pPr>
+        <w:spacing w:after="160"/>
+        <w:jc w:val="both"/>
+      </w:pPr>
+      <w:r>
+        <w:t xml:space="preserve">A empresa de Andorra pode participar — desde que o PRODUTO nao seja "de Andorra". O desenho licito usado no mercado:</w:t>
+      </w:r>
+    </w:p>
+    <w:p>
+      <w:pPr>
+        <w:spacing w:after="120"/>
+        <w:ind w:left="360"/>
+      </w:pPr>
+      <w:r>
+        <w:rPr>
+          <w:b/>
+          <w:bCs/>
+        </w:rPr>
+        <w:t xml:space="preserve">1. </w:t>
+      </w:r>
+      <w:r>
+        <w:rPr>
+          <w:b/>
+          <w:bCs/>
+        </w:rPr>
+        <w:t xml:space="preserve">Fabricacao e regularizacao num pais onde CBD medicinal e legal</w:t>
+      </w:r>
+      <w:r>
+        <w:t xml:space="preserve"> (ex.: Portugal, Suica, Reino Unido, EUA, Colombia, Uruguai). O produto nasce registrado/regularizado LA.</w:t>
+      </w:r>
+    </w:p>
+    <w:p>
+      <w:pPr>
+        <w:spacing w:after="120"/>
+        <w:ind w:left="360"/>
+      </w:pPr>
+      <w:r>
+        <w:rPr>
+          <w:b/>
+          <w:bCs/>
+        </w:rPr>
+        <w:t xml:space="preserve">2. </w:t>
+      </w:r>
+      <w:r>
+        <w:rPr>
+          <w:b/>
+          <w:bCs/>
+        </w:rPr>
+        <w:t xml:space="preserve">Logistica e despacho a partir desse pais</w:t>
+      </w:r>
+      <w:r>
+        <w:t xml:space="preserve"> — a remessa sai de la direto para o endereco do paciente brasileiro (fulfilment local). O "pais de origem" para a RDC 660 e esse, nao Andorra.</w:t>
+      </w:r>
+    </w:p>
+    <w:p>
+      <w:pPr>
+        <w:spacing w:after="120"/>
+        <w:ind w:left="360"/>
+      </w:pPr>
+      <w:r>
+        <w:rPr>
+          <w:b/>
+          <w:bCs/>
+        </w:rPr>
+        <w:t xml:space="preserve">3. </w:t>
+      </w:r>
+      <w:r>
+        <w:rPr>
+          <w:b/>
+          <w:bCs/>
+        </w:rPr>
+        <w:t xml:space="preserve">A empresa andorrana atua como dona da marca, contratante da fabricacao (white label) e/ou merchant of record</w:t>
+      </w:r>
+      <w:r>
+        <w:t xml:space="preserve"> — ela fatura a venda internacional, mas nao toca fisicamente no produto.</w:t>
+      </w:r>
+    </w:p>
+    <w:p>
+      <w:pPr>
+        <w:spacing w:after="120"/>
+        <w:ind w:left="360"/>
+      </w:pPr>
+      <w:r>
+        <w:rPr>
+          <w:b/>
+          <w:bCs/>
+        </w:rPr>
+        <w:t xml:space="preserve">4. </w:t>
+      </w:r>
+      <w:r>
+        <w:t xml:space="preserve">No Brasil, a operacao (Gota Verde) orienta o paciente: consulta, receita, cadastro na ANVISA, acompanhamento — sem nunca vender nem importar em nome proprio.</w:t>
+      </w:r>
+    </w:p>
+    <w:p>
+      <w:pPr>
+        <w:spacing w:after="160"/>
+        <w:jc w:val="both"/>
+      </w:pPr>
+      <w:r>
+        <w:t xml:space="preserve">Limites honestos desse arranjo:</w:t>
+      </w:r>
+    </w:p>
+    <w:p>
+      <w:pPr>
+        <w:pStyle w:val="ListParagraph"/>
+        <w:numPr>
+          <w:ilvl w:val="0"/>
+          <w:numId w:val="1"/>
+        </w:numPr>
+      </w:pPr>
+      <w:r>
+        <w:t xml:space="preserve">E venda direta ao paciente importador — </w:t>
+      </w:r>
+      <w:r>
+        <w:rPr>
+          <w:b/>
+          <w:bCs/>
+        </w:rPr>
+        <w:t xml:space="preserve">nao e</w:t>
+      </w:r>
+      <w:r>
+        <w:t xml:space="preserve"> vender em farmacia brasileira, nao escala como varejo nacional e depende do paciente topar o processo de importacao.</w:t>
+      </w:r>
+    </w:p>
+    <w:p>
+      <w:pPr>
+        <w:pStyle w:val="ListParagraph"/>
+        <w:numPr>
+          <w:ilvl w:val="0"/>
+          <w:numId w:val="1"/>
+        </w:numPr>
+      </w:pPr>
+      <w:r>
+        <w:t xml:space="preserve">Meios de pagamento internacionais frequentemente recusam merchant de produtos de cannabis; a escolha do adquirente e um problema real.</w:t>
+      </w:r>
+    </w:p>
+    <w:p>
+      <w:pPr>
+        <w:pStyle w:val="ListParagraph"/>
+        <w:numPr>
+          <w:ilvl w:val="0"/>
+          <w:numId w:val="1"/>
+        </w:numPr>
+      </w:pPr>
+      <w:r>
+        <w:t xml:space="preserve">Se um dia o objetivo for a prateleira da farmacia brasileira (RDC 327), quem precisa de certificacao ANVISA de Boas Praticas e o FABRICANTE — de novo o pais produtor, nunca Andorra.</w:t>
+      </w:r>
+    </w:p>
+    <w:p>
+      <w:pPr>
+        <w:pStyle w:val="ListParagraph"/>
+        <w:numPr>
+          <w:ilvl w:val="0"/>
+          <w:numId w:val="1"/>
+        </w:numPr>
+      </w:pPr>
+      <w:r>
+        <w:t xml:space="preserve">Estrutura Andorra-Brasil exige parecer tributario (CFC/regime privilegiado) antes do primeiro contrato.</w:t>
+      </w:r>
+    </w:p>
+    <w:p>
+      <w:pPr>
+        <w:pStyle w:val="Heading2"/>
+        <w:jc w:val="center"/>
+      </w:pPr>
+      <w:r>
+        <w:rPr>
+          <w:b/>
+          <w:bCs/>
+        </w:rPr>
+        <w:t xml:space="preserve">Resumo em uma frase</w:t>
+      </w:r>
+    </w:p>
+    <w:p>
+      <w:pPr>
+        <w:spacing w:after="160"/>
+        <w:jc w:val="both"/>
+      </w:pPr>
+      <w:r>
+        <w:t xml:space="preserve">A receita do CRM permite que o PACIENTE importe; a empresa andorrana pode ser a marca e o caixa dessa venda, mas o produto tem que nascer e sair de um pais onde ele e legal — e esse pais, hoje, nao pode ser Andorra.</w:t>
       </w:r>
     </w:p>
     <w:p>

</xml_diff>

<commit_message>
Via RDC 660 detalhada: origens de importacao, papel da facilitadora e linha vermelha
Co-Authored-By: Claude <noreply@anthropic.com>
Claude-Session: https://claude.ai/code/session_018WZd4PZy53xqMaYcFDrxLe
</commit_message>
<xml_diff>
--- a/docs/cannabis/LICENCAS_VENDA_CBD_ANDORRA_BRASIL.docx
+++ b/docs/cannabis/LICENCAS_VENDA_CBD_ANDORRA_BRASIL.docx
@@ -962,6 +962,631 @@
       </w:pPr>
       <w:r>
         <w:t xml:space="preserve">A receita do CRM permite que o PACIENTE importe; a empresa andorrana pode ser a marca e o caixa dessa venda, mas o produto tem que nascer e sair de um pais onde ele e legal — e esse pais, hoje, nao pode ser Andorra.</w:t>
+      </w:r>
+    </w:p>
+    <w:p>
+      <w:pPr>
+        <w:pStyle w:val="Heading1"/>
+        <w:jc w:val="center"/>
+      </w:pPr>
+      <w:r>
+        <w:rPr>
+          <w:b/>
+          <w:bCs/>
+        </w:rPr>
+        <w:t xml:space="preserve">2c. O modelo "so o paciente passa pela ANVISA": de onde importar e como facilitar dentro da lei</w:t>
+      </w:r>
+    </w:p>
+    <w:p>
+      <w:pPr>
+        <w:spacing w:after="160"/>
+        <w:jc w:val="both"/>
+      </w:pPr>
+      <w:r>
+        <w:t xml:space="preserve">Este e o unico desenho em que a empresa nao precisa de habilitacao ANVISA: a via da RDC 660/2022, em que a REGULARIZACAO e do paciente. A empresa participa em dois papeis licitos — vendedora NO EXTERIOR e facilitadora NO BRASIL — e ha uma linha vermelha entre facilitar e vender disfarcado.</w:t>
+      </w:r>
+    </w:p>
+    <w:p>
+      <w:pPr>
+        <w:pStyle w:val="Heading2"/>
+        <w:jc w:val="center"/>
+      </w:pPr>
+      <w:r>
+        <w:rPr>
+          <w:b/>
+          <w:bCs/>
+        </w:rPr>
+        <w:t xml:space="preserve">De onde importar (paises onde o produto e regularizado)</w:t>
+      </w:r>
+    </w:p>
+    <w:p>
+      <w:pPr>
+        <w:spacing w:after="160"/>
+        <w:jc w:val="both"/>
+      </w:pPr>
+      <w:r>
+        <w:t xml:space="preserve">O requisito da RDC 660 e que o produto seja regularizado no pais de origem. Na pratica do mercado brasileiro, as origens que funcionam:</w:t>
+      </w:r>
+    </w:p>
+    <w:tbl>
+      <w:tblPr>
+        <w:tblW w:type="dxa" w:w="9360"/>
+        <w:tblBorders>
+          <w:top w:val="single" w:color="auto" w:sz="4"/>
+          <w:left w:val="single" w:color="auto" w:sz="4"/>
+          <w:bottom w:val="single" w:color="auto" w:sz="4"/>
+          <w:right w:val="single" w:color="auto" w:sz="4"/>
+          <w:insideH w:val="single" w:color="auto" w:sz="4"/>
+          <w:insideV w:val="single" w:color="auto" w:sz="4"/>
+        </w:tblBorders>
+      </w:tblPr>
+      <w:tblGrid>
+        <w:gridCol w:w="3120"/>
+        <w:gridCol w:w="3120"/>
+        <w:gridCol w:w="3120"/>
+      </w:tblGrid>
+      <w:tr>
+        <w:tc>
+          <w:tcPr>
+            <w:tcW w:type="dxa" w:w="3120"/>
+          </w:tcPr>
+          <w:p>
+            <w:r>
+              <w:rPr>
+                <w:b/>
+                <w:bCs/>
+              </w:rPr>
+              <w:t xml:space="preserve">Origem</w:t>
+            </w:r>
+          </w:p>
+        </w:tc>
+        <w:tc>
+          <w:tcPr>
+            <w:tcW w:type="dxa" w:w="3120"/>
+          </w:tcPr>
+          <w:p>
+            <w:r>
+              <w:rPr>
+                <w:b/>
+                <w:bCs/>
+              </w:rPr>
+              <w:t xml:space="preserve">Por que funciona</w:t>
+            </w:r>
+          </w:p>
+        </w:tc>
+        <w:tc>
+          <w:tcPr>
+            <w:tcW w:type="dxa" w:w="3120"/>
+          </w:tcPr>
+          <w:p>
+            <w:r>
+              <w:rPr>
+                <w:b/>
+                <w:bCs/>
+              </w:rPr>
+              <w:t xml:space="preserve">Observacao</w:t>
+            </w:r>
+          </w:p>
+        </w:tc>
+      </w:tr>
+      <w:tr>
+        <w:tc>
+          <w:tcPr>
+            <w:tcW w:type="dxa" w:w="3120"/>
+          </w:tcPr>
+          <w:p>
+            <w:r>
+              <w:rPr>
+                <w:b w:val="false"/>
+                <w:bCs w:val="false"/>
+              </w:rPr>
+              <w:t xml:space="preserve">Estados Unidos</w:t>
+            </w:r>
+          </w:p>
+        </w:tc>
+        <w:tc>
+          <w:tcPr>
+            <w:tcW w:type="dxa" w:w="3120"/>
+          </w:tcPr>
+          <w:p>
+            <w:r>
+              <w:rPr>
+                <w:b w:val="false"/>
+                <w:bCs w:val="false"/>
+              </w:rPr>
+              <w:t xml:space="preserve">CBD derivado de canhamo e legal em nivel federal (Farm Bill 2018, THC ate 0,3%); industria madura, laudos COA por lote; e de longe a origem mais usada pelos pacientes brasileiros</w:t>
+            </w:r>
+          </w:p>
+        </w:tc>
+        <w:tc>
+          <w:tcPr>
+            <w:tcW w:type="dxa" w:w="3120"/>
+          </w:tcPr>
+          <w:p>
+            <w:r>
+              <w:rPr>
+                <w:b w:val="false"/>
+                <w:bCs w:val="false"/>
+              </w:rPr>
+              <w:t xml:space="preserve">Frete e prazo bons; ampla oferta white label</w:t>
+            </w:r>
+          </w:p>
+        </w:tc>
+      </w:tr>
+      <w:tr>
+        <w:tc>
+          <w:tcPr>
+            <w:tcW w:type="dxa" w:w="3120"/>
+          </w:tcPr>
+          <w:p>
+            <w:r>
+              <w:rPr>
+                <w:b w:val="false"/>
+                <w:bCs w:val="false"/>
+              </w:rPr>
+              <w:t xml:space="preserve">Reino Unido</w:t>
+            </w:r>
+          </w:p>
+        </w:tc>
+        <w:tc>
+          <w:tcPr>
+            <w:tcW w:type="dxa" w:w="3120"/>
+          </w:tcPr>
+          <w:p>
+            <w:r>
+              <w:rPr>
+                <w:b w:val="false"/>
+                <w:bCs w:val="false"/>
+              </w:rPr>
+              <w:t xml:space="preserve">CBD legal como novel food; fabricantes com GMP</w:t>
+            </w:r>
+          </w:p>
+        </w:tc>
+        <w:tc>
+          <w:tcPr>
+            <w:tcW w:type="dxa" w:w="3120"/>
+          </w:tcPr>
+          <w:p>
+            <w:r>
+              <w:rPr>
+                <w:b w:val="false"/>
+                <w:bCs w:val="false"/>
+              </w:rPr>
+              <w:t xml:space="preserve">Custo maior</w:t>
+            </w:r>
+          </w:p>
+        </w:tc>
+      </w:tr>
+      <w:tr>
+        <w:tc>
+          <w:tcPr>
+            <w:tcW w:type="dxa" w:w="3120"/>
+          </w:tcPr>
+          <w:p>
+            <w:r>
+              <w:rPr>
+                <w:b w:val="false"/>
+                <w:bCs w:val="false"/>
+              </w:rPr>
+              <w:t xml:space="preserve">Suica</w:t>
+            </w:r>
+          </w:p>
+        </w:tc>
+        <w:tc>
+          <w:tcPr>
+            <w:tcW w:type="dxa" w:w="3120"/>
+          </w:tcPr>
+          <w:p>
+            <w:r>
+              <w:rPr>
+                <w:b w:val="false"/>
+                <w:bCs w:val="false"/>
+              </w:rPr>
+              <w:t xml:space="preserve">THC ate 1% permitido; industria forte de extratos</w:t>
+            </w:r>
+          </w:p>
+        </w:tc>
+        <w:tc>
+          <w:tcPr>
+            <w:tcW w:type="dxa" w:w="3120"/>
+          </w:tcPr>
+          <w:p>
+            <w:r>
+              <w:rPr>
+                <w:b w:val="false"/>
+                <w:bCs w:val="false"/>
+              </w:rPr>
+              <w:t xml:space="preserve">Bom para full spectrum</w:t>
+            </w:r>
+          </w:p>
+        </w:tc>
+      </w:tr>
+      <w:tr>
+        <w:tc>
+          <w:tcPr>
+            <w:tcW w:type="dxa" w:w="3120"/>
+          </w:tcPr>
+          <w:p>
+            <w:r>
+              <w:rPr>
+                <w:b w:val="false"/>
+                <w:bCs w:val="false"/>
+              </w:rPr>
+              <w:t xml:space="preserve">Portugal / UE</w:t>
+            </w:r>
+          </w:p>
+        </w:tc>
+        <w:tc>
+          <w:tcPr>
+            <w:tcW w:type="dxa" w:w="3120"/>
+          </w:tcPr>
+          <w:p>
+            <w:r>
+              <w:rPr>
+                <w:b w:val="false"/>
+                <w:bCs w:val="false"/>
+              </w:rPr>
+              <w:t xml:space="preserve">Cultivo e fabricacao licenciados (Infarmed); porta de entrada natural para marca "europeia"</w:t>
+            </w:r>
+          </w:p>
+        </w:tc>
+        <w:tc>
+          <w:tcPr>
+            <w:tcW w:type="dxa" w:w="3120"/>
+          </w:tcPr>
+          <w:p>
+            <w:r>
+              <w:rPr>
+                <w:b w:val="false"/>
+                <w:bCs w:val="false"/>
+              </w:rPr>
+              <w:t xml:space="preserve">Regras variam por pais da UE</w:t>
+            </w:r>
+          </w:p>
+        </w:tc>
+      </w:tr>
+      <w:tr>
+        <w:tc>
+          <w:tcPr>
+            <w:tcW w:type="dxa" w:w="3120"/>
+          </w:tcPr>
+          <w:p>
+            <w:r>
+              <w:rPr>
+                <w:b w:val="false"/>
+                <w:bCs w:val="false"/>
+              </w:rPr>
+              <w:t xml:space="preserve">Colombia e Uruguai</w:t>
+            </w:r>
+          </w:p>
+        </w:tc>
+        <w:tc>
+          <w:tcPr>
+            <w:tcW w:type="dxa" w:w="3120"/>
+          </w:tcPr>
+          <w:p>
+            <w:r>
+              <w:rPr>
+                <w:b w:val="false"/>
+                <w:bCs w:val="false"/>
+              </w:rPr>
+              <w:t xml:space="preserve">Marcos regulatorios proprios, custo de producao baixo</w:t>
+            </w:r>
+          </w:p>
+        </w:tc>
+        <w:tc>
+          <w:tcPr>
+            <w:tcW w:type="dxa" w:w="3120"/>
+          </w:tcPr>
+          <w:p>
+            <w:r>
+              <w:rPr>
+                <w:b w:val="false"/>
+                <w:bCs w:val="false"/>
+              </w:rPr>
+              <w:t xml:space="preserve">Logistica de remessa expressa menos rodada</w:t>
+            </w:r>
+          </w:p>
+        </w:tc>
+      </w:tr>
+    </w:tbl>
+    <w:p/>
+    <w:p>
+      <w:pPr>
+        <w:spacing w:after="160"/>
+        <w:jc w:val="both"/>
+      </w:pPr>
+      <w:r>
+        <w:t xml:space="preserve">Criterio de escolha: origem com produto legalmente vendavel la, COA (laudo) por lote, fabricante com GMP e operacao de remessa expressa internacional ja rodando para o Brasil.</w:t>
+      </w:r>
+    </w:p>
+    <w:p>
+      <w:pPr>
+        <w:pStyle w:val="Heading2"/>
+        <w:jc w:val="center"/>
+      </w:pPr>
+      <w:r>
+        <w:rPr>
+          <w:b/>
+          <w:bCs/>
+        </w:rPr>
+        <w:t xml:space="preserve">O fluxo completo, passo a passo</w:t>
+      </w:r>
+    </w:p>
+    <w:p>
+      <w:pPr>
+        <w:spacing w:after="120"/>
+        <w:ind w:left="360"/>
+      </w:pPr>
+      <w:r>
+        <w:rPr>
+          <w:b/>
+          <w:bCs/>
+        </w:rPr>
+        <w:t xml:space="preserve">1. </w:t>
+      </w:r>
+      <w:r>
+        <w:rPr>
+          <w:b/>
+          <w:bCs/>
+        </w:rPr>
+        <w:t xml:space="preserve">Medico prescreve</w:t>
+      </w:r>
+      <w:r>
+        <w:t xml:space="preserve"> (qualquer CRM ativo; telemedicina vale).</w:t>
+      </w:r>
+    </w:p>
+    <w:p>
+      <w:pPr>
+        <w:spacing w:after="120"/>
+        <w:ind w:left="360"/>
+      </w:pPr>
+      <w:r>
+        <w:rPr>
+          <w:b/>
+          <w:bCs/>
+        </w:rPr>
+        <w:t xml:space="preserve">2. </w:t>
+      </w:r>
+      <w:r>
+        <w:rPr>
+          <w:b/>
+          <w:bCs/>
+        </w:rPr>
+        <w:t xml:space="preserve">Paciente cadastra a receita no Gov.br</w:t>
+      </w:r>
+      <w:r>
+        <w:t xml:space="preserve"> ("Solicitar autorizacao para importacao de produtos derivados de Cannabis") — aprovacao em geral automatica/rapida; autorizacao vale 2 anos e cobre os produtos solicitados.</w:t>
+      </w:r>
+    </w:p>
+    <w:p>
+      <w:pPr>
+        <w:spacing w:after="120"/>
+        <w:ind w:left="360"/>
+      </w:pPr>
+      <w:r>
+        <w:rPr>
+          <w:b/>
+          <w:bCs/>
+        </w:rPr>
+        <w:t xml:space="preserve">3. </w:t>
+      </w:r>
+      <w:r>
+        <w:rPr>
+          <w:b/>
+          <w:bCs/>
+        </w:rPr>
+        <w:t xml:space="preserve">Paciente compra no site estrangeiro</w:t>
+      </w:r>
+      <w:r>
+        <w:t xml:space="preserve"> (a venda ocorre FORA do Brasil; quem fatura e a empresa de fora — e ai que entra a estrangeira do grupo, com produto originado num pais da tabela).</w:t>
+      </w:r>
+    </w:p>
+    <w:p>
+      <w:pPr>
+        <w:spacing w:after="120"/>
+        <w:ind w:left="360"/>
+      </w:pPr>
+      <w:r>
+        <w:rPr>
+          <w:b/>
+          <w:bCs/>
+        </w:rPr>
+        <w:t xml:space="preserve">4. </w:t>
+      </w:r>
+      <w:r>
+        <w:rPr>
+          <w:b/>
+          <w:bCs/>
+        </w:rPr>
+        <w:t xml:space="preserve">Remessa expressa</w:t>
+      </w:r>
+      <w:r>
+        <w:t xml:space="preserve"> (courier) para o endereco do paciente com a receita + autorizacao anexadas; a ANVISA libera no aeroporto.</w:t>
+      </w:r>
+    </w:p>
+    <w:p>
+      <w:pPr>
+        <w:spacing w:after="120"/>
+        <w:ind w:left="360"/>
+      </w:pPr>
+      <w:r>
+        <w:rPr>
+          <w:b/>
+          <w:bCs/>
+        </w:rPr>
+        <w:t xml:space="preserve">5. </w:t>
+      </w:r>
+      <w:r>
+        <w:rPr>
+          <w:b/>
+          <w:bCs/>
+        </w:rPr>
+        <w:t xml:space="preserve">Uso proprio</w:t>
+      </w:r>
+      <w:r>
+        <w:t xml:space="preserve"> — o paciente nao pode revender nem repassar.</w:t>
+      </w:r>
+    </w:p>
+    <w:p>
+      <w:pPr>
+        <w:pStyle w:val="Heading2"/>
+        <w:jc w:val="center"/>
+      </w:pPr>
+      <w:r>
+        <w:rPr>
+          <w:b/>
+          <w:bCs/>
+        </w:rPr>
+        <w:t xml:space="preserve">O que a empresa BRASILEIRA pode fazer para facilitar (licito)</w:t>
+      </w:r>
+    </w:p>
+    <w:p>
+      <w:pPr>
+        <w:pStyle w:val="ListParagraph"/>
+        <w:numPr>
+          <w:ilvl w:val="0"/>
+          <w:numId w:val="1"/>
+        </w:numPr>
+      </w:pPr>
+      <w:r>
+        <w:t xml:space="preserve">Plataforma de consultas com prescritores (a Gota Verde) — agenda, telemedicina, receita digital.</w:t>
+      </w:r>
+    </w:p>
+    <w:p>
+      <w:pPr>
+        <w:pStyle w:val="ListParagraph"/>
+        <w:numPr>
+          <w:ilvl w:val="0"/>
+          <w:numId w:val="1"/>
+        </w:numPr>
+      </w:pPr>
+      <w:r>
+        <w:rPr>
+          <w:b/>
+          <w:bCs/>
+        </w:rPr>
+        <w:t xml:space="preserve">Servico de despachante regulatorio</w:t>
+      </w:r>
+      <w:r>
+        <w:t xml:space="preserve">: preencher o cadastro Gov.br pelo paciente (com procuracao/consentimento), acompanhar a autorizacao, orientar sobre a remessa. Pode COBRAR por esse servico.</w:t>
+      </w:r>
+    </w:p>
+    <w:p>
+      <w:pPr>
+        <w:pStyle w:val="ListParagraph"/>
+        <w:numPr>
+          <w:ilvl w:val="0"/>
+          <w:numId w:val="1"/>
+        </w:numPr>
+      </w:pPr>
+      <w:r>
+        <w:t xml:space="preserve">Conteudo educacional, comparador de precos, acompanhamento clinico e farmacovigilancia por assinatura.</w:t>
+      </w:r>
+    </w:p>
+    <w:p>
+      <w:pPr>
+        <w:pStyle w:val="ListParagraph"/>
+        <w:numPr>
+          <w:ilvl w:val="0"/>
+          <w:numId w:val="1"/>
+        </w:numPr>
+      </w:pPr>
+      <w:r>
+        <w:t xml:space="preserve">Integrar o fluxo: consulta -&gt; receita -&gt; cadastro -&gt; link do site estrangeiro -&gt; acompanhamento. O paciente clica, mas COMPRA la fora.</w:t>
+      </w:r>
+    </w:p>
+    <w:p>
+      <w:pPr>
+        <w:pStyle w:val="Heading2"/>
+        <w:jc w:val="center"/>
+      </w:pPr>
+      <w:r>
+        <w:rPr>
+          <w:b/>
+          <w:bCs/>
+        </w:rPr>
+        <w:t xml:space="preserve">A linha vermelha (o que transforma tudo em crime)</w:t>
+      </w:r>
+    </w:p>
+    <w:p>
+      <w:pPr>
+        <w:pStyle w:val="ListParagraph"/>
+        <w:numPr>
+          <w:ilvl w:val="0"/>
+          <w:numId w:val="1"/>
+        </w:numPr>
+      </w:pPr>
+      <w:r>
+        <w:t xml:space="preserve">A empresa brasileira </w:t>
+      </w:r>
+      <w:r>
+        <w:rPr>
+          <w:b/>
+          <w:bCs/>
+        </w:rPr>
+        <w:t xml:space="preserve">nao pode</w:t>
+      </w:r>
+      <w:r>
+        <w:t xml:space="preserve">: receber o pagamento do PRODUTO, manter estoque no Brasil, importar em nome proprio para revender, entregar produto ao paciente, ou "vender" e depois formalizar como se fosse importacao do paciente. Qualquer uma dessas e venda de produto sem registro (crime sanitario, art. 273 do Codigo Penal) e pode configurar trafico.</w:t>
+      </w:r>
+    </w:p>
+    <w:p>
+      <w:pPr>
+        <w:pStyle w:val="ListParagraph"/>
+        <w:numPr>
+          <w:ilvl w:val="0"/>
+          <w:numId w:val="1"/>
+        </w:numPr>
+      </w:pPr>
+      <w:r>
+        <w:t xml:space="preserve">O pagamento do produto vai do paciente DIRETO para a empresa estrangeira (cartao internacional/gateway dela). A brasileira fatura apenas consulta e servicos.</w:t>
+      </w:r>
+    </w:p>
+    <w:p>
+      <w:pPr>
+        <w:pStyle w:val="ListParagraph"/>
+        <w:numPr>
+          <w:ilvl w:val="0"/>
+          <w:numId w:val="1"/>
+        </w:numPr>
+      </w:pPr>
+      <w:r>
+        <w:t xml:space="preserve">Sem promessa terapeutica em publicidade; sem anunciar o produto ao publico (a publicidade licita e do SERVICO de facilitacao e do conteudo educacional).</w:t>
+      </w:r>
+    </w:p>
+    <w:p>
+      <w:pPr>
+        <w:pStyle w:val="ListParagraph"/>
+        <w:numPr>
+          <w:ilvl w:val="0"/>
+          <w:numId w:val="1"/>
+        </w:numPr>
+      </w:pPr>
+      <w:r>
+        <w:t xml:space="preserve">Se a mesma pessoa controla a estrangeira e a brasileira, contratos e precos entre elas precisam de suporte tributario (transfer pricing).</w:t>
+      </w:r>
+    </w:p>
+    <w:p>
+      <w:pPr>
+        <w:pStyle w:val="Heading2"/>
+        <w:jc w:val="center"/>
+      </w:pPr>
+      <w:r>
+        <w:rPr>
+          <w:b/>
+          <w:bCs/>
+        </w:rPr>
+        <w:t xml:space="preserve">Resumo operacional</w:t>
+      </w:r>
+    </w:p>
+    <w:p>
+      <w:pPr>
+        <w:spacing w:after="160"/>
+        <w:jc w:val="both"/>
+      </w:pPr>
+      <w:r>
+        <w:t xml:space="preserve">Empresa estrangeira (origem EUA/UE/Suica, ou merchant andorrano com fabricacao e despacho nesses paises) vende e despacha; paciente importa com receita e cadastro proprio; empresa brasileira fatura consulta e concierge regulatorio. Ninguem da estrutura toca no produto em solo brasileiro — e por isso ninguem precisa de AFE/AE. E o modelo que grandes operadores do setor usam hoje, e e exatamente o desenho da Gota Verde na fase 1.</w:t>
       </w:r>
     </w:p>
     <w:p>

</xml_diff>

<commit_message>
Modelo RDC 660: associacao de pacientes assume o papel de facilitadora brasileira
Co-Authored-By: Claude <noreply@anthropic.com>
Claude-Session: https://claude.ai/code/session_018WZd4PZy53xqMaYcFDrxLe
</commit_message>
<xml_diff>
--- a/docs/cannabis/LICENCAS_VENDA_CBD_ANDORRA_BRASIL.docx
+++ b/docs/cannabis/LICENCAS_VENDA_CBD_ANDORRA_BRASIL.docx
@@ -1591,6 +1591,76 @@
     </w:p>
     <w:p>
       <w:pPr>
+        <w:pStyle w:val="Heading2"/>
+        <w:jc w:val="center"/>
+      </w:pPr>
+      <w:r>
+        <w:rPr>
+          <w:b/>
+          <w:bCs/>
+        </w:rPr>
+        <w:t xml:space="preserve">Variante escolhida: a facilitadora brasileira e a ASSOCIACAO</w:t>
+      </w:r>
+    </w:p>
+    <w:p>
+      <w:pPr>
+        <w:spacing w:after="160"/>
+        <w:jc w:val="both"/>
+      </w:pPr>
+      <w:r>
+        <w:t xml:space="preserve">Decisao de 25/08/2026: no lugar de empresa brasileira, a facilitadora e a associacao de pacientes (estatuto ja redigido). O que muda:</w:t>
+      </w:r>
+    </w:p>
+    <w:p>
+      <w:pPr>
+        <w:pStyle w:val="ListParagraph"/>
+        <w:numPr>
+          <w:ilvl w:val="0"/>
+          <w:numId w:val="1"/>
+        </w:numPr>
+      </w:pPr>
+      <w:r>
+        <w:t xml:space="preserve">As receitas de servico viram contribuicao associativa e servicos a preco social (consulta social com medicos parceiros, despachante, acompanhamento).</w:t>
+      </w:r>
+    </w:p>
+    <w:p>
+      <w:pPr>
+        <w:pStyle w:val="ListParagraph"/>
+        <w:numPr>
+          <w:ilvl w:val="0"/>
+          <w:numId w:val="1"/>
+        </w:numPr>
+      </w:pPr>
+      <w:r>
+        <w:t xml:space="preserve">A associacao pode atuar como REPRESENTANTE do associado na importacao (a RDC 660 admite representante/procurador) — conduz cadastro e importacao em nome dele com mais naturalidade que empresa comercial.</w:t>
+      </w:r>
+    </w:p>
+    <w:p>
+      <w:pPr>
+        <w:pStyle w:val="ListParagraph"/>
+        <w:numPr>
+          <w:ilvl w:val="0"/>
+          <w:numId w:val="1"/>
+        </w:numPr>
+      </w:pPr>
+      <w:r>
+        <w:t xml:space="preserve">So a associacao tem a porta do cultivo com autorizacao judicial (fornecimento sem lucro a associados) e acesso a beneficios de entidade sem fins lucrativos.</w:t>
+      </w:r>
+    </w:p>
+    <w:p>
+      <w:pPr>
+        <w:pStyle w:val="ListParagraph"/>
+        <w:numPr>
+          <w:ilvl w:val="0"/>
+          <w:numId w:val="1"/>
+        </w:numPr>
+      </w:pPr>
+      <w:r>
+        <w:t xml:space="preserve">O limite: superavit reinveste, ninguem distribui dividendo. O arranjo maduro do setor: associacao na frente assistencial + empresa do grupo vendendo software e servicos A associacao, a precos de mercado documentados (e a empresa estrangeira vendendo o produto ao paciente, como antes).</w:t>
+      </w:r>
+    </w:p>
+    <w:p>
+      <w:pPr>
         <w:pStyle w:val="Heading1"/>
         <w:jc w:val="center"/>
       </w:pPr>

</xml_diff>